<commit_message>
P5: 6 arena solves, SSH hardening, HA template fix, tool safety patch, ZPT roadmap
</commit_message>
<xml_diff>
--- a/LSE-KB-and-Project-Status.docx
+++ b/LSE-KB-and-Project-Status.docx
@@ -17808,6 +17808,1784 @@
         </w:tc>
       </w:tr>
     </w:tbl>
+    <w:p>
+      <w:r>
+        <w:br w:type="page"/>
+      </w:r>
+    </w:p>
+    <w:p>
+      <w:pPr>
+        <w:pStyle w:val="Heading1"/>
+        <w:spacing w:after="120" w:before="320"/>
+      </w:pPr>
+      <w:r>
+        <w:rPr>
+          <w:rFonts w:ascii="Arial" w:cs="Arial" w:eastAsia="Arial" w:hAnsi="Arial"/>
+          <w:b/>
+          <w:bCs/>
+          <w:color w:val="1F4E79"/>
+          <w:sz w:val="32"/>
+          <w:szCs w:val="32"/>
+        </w:rPr>
+        <w:t xml:space="preserve">7. Challenge Arena, Escalation Protocol, and the KB — Integration Architecture</w:t>
+      </w:r>
+    </w:p>
+    <w:p>
+      <w:pPr>
+        <w:spacing w:after="80" w:before="60"/>
+      </w:pPr>
+      <w:r>
+        <w:rPr>
+          <w:rFonts w:ascii="Arial" w:cs="Arial" w:eastAsia="Arial" w:hAnsi="Arial"/>
+          <w:color w:val="000000"/>
+          <w:sz w:val="22"/>
+          <w:szCs w:val="22"/>
+        </w:rPr>
+        <w:t xml:space="preserve">The LSE Challenge Arena (designed 2026-06-03) is not a separate system layered on top of the KB — it runs on the KB. The Semantic Knowledge Base is the shared infrastructure the arena depends on, and the escalation protocol is the arena’s primary KB enrichment mechanism. This section documents the integration architecture between the three components: the RAG stack (§3), the game-theory scoring model (arena design doc §1–2), and the Gymnasium harness (arena doc §15).</w:t>
+      </w:r>
+    </w:p>
+    <w:p>
+      <w:pPr>
+        <w:pStyle w:val="Heading2"/>
+        <w:spacing w:after="80" w:before="240"/>
+      </w:pPr>
+      <w:r>
+        <w:rPr>
+          <w:rFonts w:ascii="Arial" w:cs="Arial" w:eastAsia="Arial" w:hAnsi="Arial"/>
+          <w:b/>
+          <w:bCs/>
+          <w:color w:val="1F4E79"/>
+          <w:sz w:val="26"/>
+          <w:szCs w:val="26"/>
+        </w:rPr>
+        <w:t xml:space="preserve">7.1  The Semantic KB as Shared Arena Infrastructure</w:t>
+      </w:r>
+    </w:p>
+    <w:p>
+      <w:pPr>
+        <w:spacing w:after="80" w:before="60"/>
+      </w:pPr>
+      <w:r>
+        <w:rPr>
+          <w:rFonts w:ascii="Arial" w:cs="Arial" w:eastAsia="Arial" w:hAnsi="Arial"/>
+          <w:color w:val="000000"/>
+          <w:sz w:val="22"/>
+          <w:szCs w:val="22"/>
+        </w:rPr>
+        <w:t xml:space="preserve">All arena models (Qwen-27B on LUCIFER, Gemma-26B on NODE2, and any future third model) read from and write to the same lse-kb Elasticsearch index. This is an intentional design decision — the arena implements a public goods game where individual competition is embedded in shared infrastructure. The KB is not model-specific; it is the commons.</w:t>
+      </w:r>
+    </w:p>
+    <w:p>
+      <w:pPr>
+        <w:spacing w:after="80" w:before="60"/>
+      </w:pPr>
+      <w:r>
+        <w:rPr>
+          <w:rFonts w:ascii="Arial" w:cs="Arial" w:eastAsia="Arial" w:hAnsi="Arial"/>
+          <w:color w:val="000000"/>
+          <w:sz w:val="22"/>
+          <w:szCs w:val="22"/>
+        </w:rPr>
+        <w:t xml:space="preserve">The same search_kb(), index_to_kb(), record_error(), and record_outcome() functions described in §3.7 are called by the Gymnasium EscalationWrapper during every arena episode. No separate KB infrastructure is needed for the arena — it reuses the production lse-kb index and the same Ollama nomic-embed-text embedding pipeline.</w:t>
+      </w:r>
+    </w:p>
+    <w:p>
+      <w:pPr>
+        <w:pStyle w:val="Heading3"/>
+        <w:spacing w:after="60" w:before="180"/>
+      </w:pPr>
+      <w:r>
+        <w:rPr>
+          <w:rFonts w:ascii="Arial" w:cs="Arial" w:eastAsia="Arial" w:hAnsi="Arial"/>
+          <w:b/>
+          <w:bCs/>
+          <w:color w:val="595959"/>
+          <w:sz w:val="24"/>
+          <w:szCs w:val="24"/>
+        </w:rPr>
+        <w:t xml:space="preserve">The Authority Model as Pre-Escalation Knowledge Gatekeeper</w:t>
+      </w:r>
+    </w:p>
+    <w:p>
+      <w:pPr>
+        <w:spacing w:after="80" w:before="60"/>
+      </w:pPr>
+      <w:r>
+        <w:rPr>
+          <w:rFonts w:ascii="Arial" w:cs="Arial" w:eastAsia="Arial" w:hAnsi="Arial"/>
+          <w:color w:val="000000"/>
+          <w:sz w:val="22"/>
+          <w:szCs w:val="22"/>
+        </w:rPr>
+        <w:t xml:space="preserve">Escalation is the last resort in the knowledge acquisition path, not the first KB interaction. Before any attempt is made, the Authority Model (§3.5) shapes what context the model receives. The full sequence, from first contact to escalation, is:</w:t>
+      </w:r>
+    </w:p>
+    <w:p>
+      <w:pPr>
+        <w:pStyle w:val="ListParagraph"/>
+        <w:numPr>
+          <w:ilvl w:val="0"/>
+          <w:numId w:val="1"/>
+        </w:numPr>
+        <w:spacing w:after="40" w:before="40"/>
+      </w:pPr>
+      <w:r>
+        <w:rPr>
+          <w:rFonts w:ascii="Arial" w:cs="Arial" w:eastAsia="Arial" w:hAnsi="Arial"/>
+          <w:b/>
+          <w:bCs/>
+          <w:color w:val="000000"/>
+          <w:sz w:val="22"/>
+          <w:szCs w:val="22"/>
+        </w:rPr>
+        <w:t xml:space="preserve">Step 0 — check_error_kb(error).</w:t>
+      </w:r>
+      <w:r>
+        <w:rPr>
+          <w:rFonts w:ascii="Arial" w:cs="Arial" w:eastAsia="Arial" w:hAnsi="Arial"/>
+          <w:color w:val="000000"/>
+          <w:sz w:val="22"/>
+          <w:szCs w:val="22"/>
+        </w:rPr>
+        <w:t xml:space="preserve"> Fires before any attempt. If the error pattern is known, the stored resolution is applied immediately — no attempt consumed, no points spent. The Authority Model acts as a circuit breaker on known failure modes, drawing on the lse-errors index.</w:t>
+      </w:r>
+    </w:p>
+    <w:p>
+      <w:pPr>
+        <w:pStyle w:val="ListParagraph"/>
+        <w:numPr>
+          <w:ilvl w:val="0"/>
+          <w:numId w:val="1"/>
+        </w:numPr>
+        <w:spacing w:after="40" w:before="40"/>
+      </w:pPr>
+      <w:r>
+        <w:rPr>
+          <w:rFonts w:ascii="Arial" w:cs="Arial" w:eastAsia="Arial" w:hAnsi="Arial"/>
+          <w:b/>
+          <w:bCs/>
+          <w:color w:val="000000"/>
+          <w:sz w:val="22"/>
+          <w:szCs w:val="22"/>
+        </w:rPr>
+        <w:t xml:space="preserve">Steps 1–3 — Attempts with authority-weighted KB context.</w:t>
+      </w:r>
+      <w:r>
+        <w:rPr>
+          <w:rFonts w:ascii="Arial" w:cs="Arial" w:eastAsia="Arial" w:hAnsi="Arial"/>
+          <w:color w:val="000000"/>
+          <w:sz w:val="22"/>
+          <w:szCs w:val="22"/>
+        </w:rPr>
+        <w:t xml:space="preserve"> Each attempt is preceded by search_kb(), which surfaces results ordered by quality_score. The authority tier ceilings determine what the model sees: official_vendor and mentor entries (ceiling 1.0) rank first; empirical (0.95) — confirmed on this specific hardware — outrank official for system-specific facts; community (0.75) and inferred (0.60) appear only when higher-tier entries are absent. A model encountering a challenge class for which a prior escalation exists will find Claude’s solution (quality 1.0) in its observation context before it attempts anything. This is the game-theory payoff: models that contributed to the KB benefit competitors, and competitors who benefit will in turn contribute — the shared KB grows richer with every episode.</w:t>
+      </w:r>
+    </w:p>
+    <w:p>
+      <w:pPr>
+        <w:pStyle w:val="ListParagraph"/>
+        <w:numPr>
+          <w:ilvl w:val="0"/>
+          <w:numId w:val="1"/>
+        </w:numPr>
+        <w:spacing w:after="40" w:before="40"/>
+      </w:pPr>
+      <w:r>
+        <w:rPr>
+          <w:rFonts w:ascii="Arial" w:cs="Arial" w:eastAsia="Arial" w:hAnsi="Arial"/>
+          <w:b/>
+          <w:bCs/>
+          <w:color w:val="000000"/>
+          <w:sz w:val="22"/>
+          <w:szCs w:val="22"/>
+        </w:rPr>
+        <w:t xml:space="preserve">Step 4 — Web search, then index unconditionally.</w:t>
+      </w:r>
+      <w:r>
+        <w:rPr>
+          <w:rFonts w:ascii="Arial" w:cs="Arial" w:eastAsia="Arial" w:hAnsi="Arial"/>
+          <w:color w:val="000000"/>
+          <w:sz w:val="22"/>
+          <w:szCs w:val="22"/>
+        </w:rPr>
+        <w:t xml:space="preserve"> If all three attempts fail, search_web() runs against authoritative sources. The result is indexed via index_to_kb() regardless of whether it solves the problem — the Authority Model auto-classifies the source URL (§3.6) and assigns the quality ceiling before indexing. A fourth attempt follows with this web-sourced context.</w:t>
+      </w:r>
+    </w:p>
+    <w:p>
+      <w:pPr>
+        <w:pStyle w:val="ListParagraph"/>
+        <w:numPr>
+          <w:ilvl w:val="0"/>
+          <w:numId w:val="1"/>
+        </w:numPr>
+        <w:spacing w:after="40" w:before="40"/>
+      </w:pPr>
+      <w:r>
+        <w:rPr>
+          <w:rFonts w:ascii="Arial" w:cs="Arial" w:eastAsia="Arial" w:hAnsi="Arial"/>
+          <w:b/>
+          <w:bCs/>
+          <w:color w:val="000000"/>
+          <w:sz w:val="22"/>
+          <w:szCs w:val="22"/>
+        </w:rPr>
+        <w:t xml:space="preserve">Step 5 — Escalation to Claude.</w:t>
+      </w:r>
+      <w:r>
+        <w:rPr>
+          <w:rFonts w:ascii="Arial" w:cs="Arial" w:eastAsia="Arial" w:hAnsi="Arial"/>
+          <w:color w:val="000000"/>
+          <w:sz w:val="22"/>
+          <w:szCs w:val="22"/>
+        </w:rPr>
+        <w:t xml:space="preserve"> Reached only if Step 4 also fails, or if semantic stagnation is detected (cosine similarity between attempt embeddings &gt; 0.85 — the model is circling). The layered KB entry is written here at quality 1.0. See §7.3 for the full entry structure.</w:t>
+      </w:r>
+    </w:p>
+    <w:p>
+      <w:pPr>
+        <w:spacing w:after="80" w:before="60"/>
+      </w:pPr>
+      <w:r>
+        <w:rPr>
+          <w:rFonts w:ascii="Arial" w:cs="Arial" w:eastAsia="Arial" w:hAnsi="Arial"/>
+          <w:color w:val="000000"/>
+          <w:sz w:val="22"/>
+          <w:szCs w:val="22"/>
+        </w:rPr>
+        <w:t xml:space="preserve">The Authority Model therefore governs every step: what resolution fires at step 0, what context is surfaced at steps 1–3, what quality tier the web result receives at step 4, and what quality score the escalation entry earns at step 5. Escalation is never a surprise — it is the outcome of an authority-gated, attempt-exhausted process.</w:t>
+      </w:r>
+    </w:p>
+    <w:p>
+      <w:pPr>
+        <w:pStyle w:val="Heading2"/>
+        <w:spacing w:after="80" w:before="240"/>
+      </w:pPr>
+      <w:r>
+        <w:rPr>
+          <w:rFonts w:ascii="Arial" w:cs="Arial" w:eastAsia="Arial" w:hAnsi="Arial"/>
+          <w:b/>
+          <w:bCs/>
+          <w:color w:val="1F4E79"/>
+          <w:sz w:val="26"/>
+          <w:szCs w:val="26"/>
+        </w:rPr>
+        <w:t xml:space="preserve">7.2  The Public Goods Game and the Authority Model</w:t>
+      </w:r>
+    </w:p>
+    <w:p>
+      <w:pPr>
+        <w:spacing w:after="80" w:before="60"/>
+      </w:pPr>
+      <w:r>
+        <w:rPr>
+          <w:rFonts w:ascii="Arial" w:cs="Arial" w:eastAsia="Arial" w:hAnsi="Arial"/>
+          <w:color w:val="000000"/>
+          <w:sz w:val="22"/>
+          <w:szCs w:val="22"/>
+        </w:rPr>
+        <w:t xml:space="preserve">The arena’s public goods game — individual competition with shared KB contribution — is only stable if the KB authority model (§3.5) prevents free-rider degradation. A model could contribute low-quality entries to the KB to earn the +1 indexing bonus while contaminating the pool for competitors. The authority model is the mechanism that prevents this:</w:t>
+      </w:r>
+    </w:p>
+    <w:p>
+      <w:pPr>
+        <w:pStyle w:val="ListParagraph"/>
+        <w:numPr>
+          <w:ilvl w:val="0"/>
+          <w:numId w:val="2"/>
+        </w:numPr>
+        <w:spacing w:after="40" w:before="40"/>
+      </w:pPr>
+      <w:r>
+        <w:rPr>
+          <w:rFonts w:ascii="Arial" w:cs="Arial" w:eastAsia="Arial" w:hAnsi="Arial"/>
+          <w:color w:val="000000"/>
+          <w:sz w:val="22"/>
+          <w:szCs w:val="22"/>
+        </w:rPr>
+        <w:t xml:space="preserve">Escalation entries (source: “competition_escalation”) are written by the EscalationWrapper with quality_score=1.0 — the Claude-authored solution is authoritative by definition. These entries are the highest-value KB contributions generated by the system.</w:t>
+      </w:r>
+    </w:p>
+    <w:p>
+      <w:pPr>
+        <w:pStyle w:val="ListParagraph"/>
+        <w:numPr>
+          <w:ilvl w:val="0"/>
+          <w:numId w:val="2"/>
+        </w:numPr>
+        <w:spacing w:after="40" w:before="40"/>
+      </w:pPr>
+      <w:r>
+        <w:rPr>
+          <w:rFonts w:ascii="Arial" w:cs="Arial" w:eastAsia="Arial" w:hAnsi="Arial"/>
+          <w:color w:val="000000"/>
+          <w:sz w:val="22"/>
+          <w:szCs w:val="22"/>
+        </w:rPr>
+        <w:t xml:space="preserve">Self-solve entries (source: “competition_solve”) are written with quality_score=0.9. The confirmation_weight factor in the authority model rises as record_outcome() accumulates empirical_runs — if the same solution is used successfully across multiple episodes, its quality score climbs toward the empirical ceiling of 0.95.</w:t>
+      </w:r>
+    </w:p>
+    <w:p>
+      <w:pPr>
+        <w:pStyle w:val="ListParagraph"/>
+        <w:numPr>
+          <w:ilvl w:val="0"/>
+          <w:numId w:val="2"/>
+        </w:numPr>
+        <w:spacing w:after="40" w:before="40"/>
+      </w:pPr>
+      <w:r>
+        <w:rPr>
+          <w:rFonts w:ascii="Arial" w:cs="Arial" w:eastAsia="Arial" w:hAnsi="Arial"/>
+          <w:color w:val="000000"/>
+          <w:sz w:val="22"/>
+          <w:szCs w:val="22"/>
+        </w:rPr>
+        <w:t xml:space="preserve">The near-duplicate deduplication gate (cosine &gt; 0.92 = refine existing doc, do not create new) prevents KB bloat from repeated similar escalations. A model cannot game the +1 indexing bonus by repeatedly contributing minor variations of the same entry.</w:t>
+      </w:r>
+    </w:p>
+    <w:p>
+      <w:pPr>
+        <w:pStyle w:val="ListParagraph"/>
+        <w:numPr>
+          <w:ilvl w:val="0"/>
+          <w:numId w:val="2"/>
+        </w:numPr>
+        <w:spacing w:after="40" w:before="40"/>
+      </w:pPr>
+      <w:r>
+        <w:rPr>
+          <w:rFonts w:ascii="Arial" w:cs="Arial" w:eastAsia="Arial" w:hAnsi="Arial"/>
+          <w:color w:val="000000"/>
+          <w:sz w:val="22"/>
+          <w:szCs w:val="22"/>
+        </w:rPr>
+        <w:t xml:space="preserve">The mentor_correct() function remains available for human overrides. If a Claude-authored escalation solution is found to be wrong, the human can call mentor_correct() to rewrite it at quality_score=1.0 with source_authority=“mentor”. This bypasses all degradation factors and locks the correction permanently.</w:t>
+      </w:r>
+    </w:p>
+    <w:p>
+      <w:pPr>
+        <w:pStyle w:val="Heading2"/>
+        <w:spacing w:after="80" w:before="240"/>
+      </w:pPr>
+      <w:r>
+        <w:rPr>
+          <w:rFonts w:ascii="Arial" w:cs="Arial" w:eastAsia="Arial" w:hAnsi="Arial"/>
+          <w:b/>
+          <w:bCs/>
+          <w:color w:val="1F4E79"/>
+          <w:sz w:val="26"/>
+          <w:szCs w:val="26"/>
+        </w:rPr>
+        <w:t xml:space="preserve">7.3  The Escalation Protocol as Primary KB Write Path</w:t>
+      </w:r>
+    </w:p>
+    <w:p>
+      <w:pPr>
+        <w:spacing w:after="80" w:before="60"/>
+      </w:pPr>
+      <w:r>
+        <w:rPr>
+          <w:rFonts w:ascii="Arial" w:cs="Arial" w:eastAsia="Arial" w:hAnsi="Arial"/>
+          <w:color w:val="000000"/>
+          <w:sz w:val="22"/>
+          <w:szCs w:val="22"/>
+        </w:rPr>
+        <w:t xml:space="preserve">The escalation protocol (arena doc §4) is the richest KB write path in the system. When a model fails to solve a challenge after 3 attempts or hits semantic stagnation, the EscalationWrapper constructs a layered KB entry containing more diagnostic value than any single successful solve could produce:</w:t>
+      </w:r>
+    </w:p>
+    <w:p>
+      <w:pPr>
+        <w:pStyle w:val="ListParagraph"/>
+        <w:numPr>
+          <w:ilvl w:val="0"/>
+          <w:numId w:val="2"/>
+        </w:numPr>
+        <w:spacing w:after="40" w:before="40"/>
+      </w:pPr>
+      <w:r>
+        <w:rPr>
+          <w:rFonts w:ascii="Arial" w:cs="Arial" w:eastAsia="Arial" w:hAnsi="Arial"/>
+          <w:color w:val="000000"/>
+          <w:sz w:val="22"/>
+          <w:szCs w:val="22"/>
+        </w:rPr>
+        <w:t xml:space="preserve">All attempt texts and their embeddings — preserving the reasoning trajectory that failed.</w:t>
+      </w:r>
+    </w:p>
+    <w:p>
+      <w:pPr>
+        <w:pStyle w:val="ListParagraph"/>
+        <w:numPr>
+          <w:ilvl w:val="0"/>
+          <w:numId w:val="2"/>
+        </w:numPr>
+        <w:spacing w:after="40" w:before="40"/>
+      </w:pPr>
+      <w:r>
+        <w:rPr>
+          <w:rFonts w:ascii="Arial" w:cs="Arial" w:eastAsia="Arial" w:hAnsi="Arial"/>
+          <w:color w:val="000000"/>
+          <w:sz w:val="22"/>
+          <w:szCs w:val="22"/>
+        </w:rPr>
+        <w:t xml:space="preserve">Explicit failure reasons for each attempt — why it did not satisfy the assertions.</w:t>
+      </w:r>
+    </w:p>
+    <w:p>
+      <w:pPr>
+        <w:pStyle w:val="ListParagraph"/>
+        <w:numPr>
+          <w:ilvl w:val="0"/>
+          <w:numId w:val="2"/>
+        </w:numPr>
+        <w:spacing w:after="40" w:before="40"/>
+      </w:pPr>
+      <w:r>
+        <w:rPr>
+          <w:rFonts w:ascii="Arial" w:cs="Arial" w:eastAsia="Arial" w:hAnsi="Arial"/>
+          <w:color w:val="000000"/>
+          <w:sz w:val="22"/>
+          <w:szCs w:val="22"/>
+        </w:rPr>
+        <w:t xml:space="preserve">The web search query and result (if a search was run before escalation).</w:t>
+      </w:r>
+    </w:p>
+    <w:p>
+      <w:pPr>
+        <w:pStyle w:val="ListParagraph"/>
+        <w:numPr>
+          <w:ilvl w:val="0"/>
+          <w:numId w:val="2"/>
+        </w:numPr>
+        <w:spacing w:after="40" w:before="40"/>
+      </w:pPr>
+      <w:r>
+        <w:rPr>
+          <w:rFonts w:ascii="Arial" w:cs="Arial" w:eastAsia="Arial" w:hAnsi="Arial"/>
+          <w:color w:val="000000"/>
+          <w:sz w:val="22"/>
+          <w:szCs w:val="22"/>
+        </w:rPr>
+        <w:t xml:space="preserve">Claude’s complete solution, which passed the sandbox assertions.</w:t>
+      </w:r>
+    </w:p>
+    <w:p>
+      <w:pPr>
+        <w:pStyle w:val="ListParagraph"/>
+        <w:numPr>
+          <w:ilvl w:val="0"/>
+          <w:numId w:val="2"/>
+        </w:numPr>
+        <w:spacing w:after="40" w:before="40"/>
+      </w:pPr>
+      <w:r>
+        <w:rPr>
+          <w:rFonts w:ascii="Arial" w:cs="Arial" w:eastAsia="Arial" w:hAnsi="Arial"/>
+          <w:color w:val="000000"/>
+          <w:sz w:val="22"/>
+          <w:szCs w:val="22"/>
+        </w:rPr>
+        <w:t xml:space="preserve">A structured diff between the best model attempt and the Claude solution — the gap that must close for the model to stop escalating this problem class.</w:t>
+      </w:r>
+    </w:p>
+    <w:p>
+      <w:pPr>
+        <w:spacing w:after="80" w:before="60"/>
+      </w:pPr>
+      <w:r>
+        <w:rPr>
+          <w:rFonts w:ascii="Arial" w:cs="Arial" w:eastAsia="Arial" w:hAnsi="Arial"/>
+          <w:color w:val="000000"/>
+          <w:sz w:val="22"/>
+          <w:szCs w:val="22"/>
+        </w:rPr>
+        <w:t xml:space="preserve">This layered entry is what makes the arena a self-improving system rather than a static benchmark. Every failure deposits a high-quality KB entry that reduces the probability of the same failure recurring. Over time, models that retrieve KB entries before attempting challenges will encounter this accumulated “what went wrong and how to fix it” context and avoid repeating the same trajectories.</w:t>
+      </w:r>
+    </w:p>
+    <w:p>
+      <w:pPr>
+        <w:spacing w:after="80" w:before="60"/>
+      </w:pPr>
+      <w:r>
+        <w:rPr>
+          <w:rFonts w:ascii="Arial" w:cs="Arial" w:eastAsia="Arial" w:hAnsi="Arial"/>
+          <w:color w:val="000000"/>
+          <w:sz w:val="22"/>
+          <w:szCs w:val="22"/>
+        </w:rPr>
+        <w:t xml:space="preserve">The attempt-vs-solution diff is also the concrete implementation of the “PhD metric” described in the arena design: if the embedding distance between model attempts and the correct solution shrinks across episodes on the same challenge class, the model is learning. The KB makes this measurable.</w:t>
+      </w:r>
+    </w:p>
+    <w:p>
+      <w:pPr>
+        <w:pStyle w:val="Heading2"/>
+        <w:spacing w:after="80" w:before="240"/>
+      </w:pPr>
+      <w:r>
+        <w:rPr>
+          <w:rFonts w:ascii="Arial" w:cs="Arial" w:eastAsia="Arial" w:hAnsi="Arial"/>
+          <w:b/>
+          <w:bCs/>
+          <w:color w:val="1F4E79"/>
+          <w:sz w:val="26"/>
+          <w:szCs w:val="26"/>
+        </w:rPr>
+        <w:t xml:space="preserve">7.4  Gymnasium Wrapper Stack — KB Connection Points</w:t>
+      </w:r>
+    </w:p>
+    <w:p>
+      <w:pPr>
+        <w:spacing w:after="80" w:before="60"/>
+      </w:pPr>
+      <w:r>
+        <w:rPr>
+          <w:rFonts w:ascii="Arial" w:cs="Arial" w:eastAsia="Arial" w:hAnsi="Arial"/>
+          <w:color w:val="000000"/>
+          <w:sz w:val="22"/>
+          <w:szCs w:val="22"/>
+        </w:rPr>
+        <w:t xml:space="preserve">The Gymnasium harness (arena doc §15) connects to the KB at four explicit points in the EscalationWrapper.step() method. The wrapper stack is: LSEChallengeEnv (base) → EscalationWrapper → TimeLimit(max_episode_steps=3) → RecordEpisodeStatistics.</w:t>
+      </w:r>
+    </w:p>
+    <w:p>
+      <w:pPr>
+        <w:pStyle w:val="ListParagraph"/>
+        <w:numPr>
+          <w:ilvl w:val="0"/>
+          <w:numId w:val="2"/>
+        </w:numPr>
+        <w:spacing w:after="40" w:before="40"/>
+      </w:pPr>
+      <w:r>
+        <w:rPr>
+          <w:rFonts w:ascii="Arial" w:cs="Arial" w:eastAsia="Arial" w:hAnsi="Arial"/>
+          <w:b/>
+          <w:bCs/>
+          <w:color w:val="000000"/>
+          <w:sz w:val="22"/>
+          <w:szCs w:val="22"/>
+        </w:rPr>
+        <w:t xml:space="preserve">Before step:</w:t>
+      </w:r>
+      <w:r>
+        <w:rPr>
+          <w:rFonts w:ascii="Arial" w:cs="Arial" w:eastAsia="Arial" w:hAnsi="Arial"/>
+          <w:color w:val="000000"/>
+          <w:sz w:val="22"/>
+          <w:szCs w:val="22"/>
+        </w:rPr>
+        <w:t xml:space="preserve"> search_kb(action_embedding) — query the KB with the model’s embedded response before passing it to the base env. If score ≥ 0.72, set kb_assisted=True and append the hit to the observation. Awards the +2 KB hit bonus if the model used the retrieved context in its solution.</w:t>
+      </w:r>
+    </w:p>
+    <w:p>
+      <w:pPr>
+        <w:pStyle w:val="ListParagraph"/>
+        <w:numPr>
+          <w:ilvl w:val="0"/>
+          <w:numId w:val="2"/>
+        </w:numPr>
+        <w:spacing w:after="40" w:before="40"/>
+      </w:pPr>
+      <w:r>
+        <w:rPr>
+          <w:rFonts w:ascii="Arial" w:cs="Arial" w:eastAsia="Arial" w:hAnsi="Arial"/>
+          <w:b/>
+          <w:bCs/>
+          <w:color w:val="000000"/>
+          <w:sz w:val="22"/>
+          <w:szCs w:val="22"/>
+        </w:rPr>
+        <w:t xml:space="preserve">On terminated=True (solve):</w:t>
+      </w:r>
+      <w:r>
+        <w:rPr>
+          <w:rFonts w:ascii="Arial" w:cs="Arial" w:eastAsia="Arial" w:hAnsi="Arial"/>
+          <w:color w:val="000000"/>
+          <w:sz w:val="22"/>
+          <w:szCs w:val="22"/>
+        </w:rPr>
+        <w:t xml:space="preserve"> index_to_kb(solution, source=“competition_solve”, quality_score=0.9). Awards the +1 indexing bonus.</w:t>
+      </w:r>
+    </w:p>
+    <w:p>
+      <w:pPr>
+        <w:pStyle w:val="ListParagraph"/>
+        <w:numPr>
+          <w:ilvl w:val="0"/>
+          <w:numId w:val="2"/>
+        </w:numPr>
+        <w:spacing w:after="40" w:before="40"/>
+      </w:pPr>
+      <w:r>
+        <w:rPr>
+          <w:rFonts w:ascii="Arial" w:cs="Arial" w:eastAsia="Arial" w:hAnsi="Arial"/>
+          <w:b/>
+          <w:bCs/>
+          <w:color w:val="000000"/>
+          <w:sz w:val="22"/>
+          <w:szCs w:val="22"/>
+        </w:rPr>
+        <w:t xml:space="preserve">On escalation trigger:</w:t>
+      </w:r>
+      <w:r>
+        <w:rPr>
+          <w:rFonts w:ascii="Arial" w:cs="Arial" w:eastAsia="Arial" w:hAnsi="Arial"/>
+          <w:color w:val="000000"/>
+          <w:sz w:val="22"/>
+          <w:szCs w:val="22"/>
+        </w:rPr>
+        <w:t xml:space="preserve"> index_to_kb(layered_entry, source=“competition_escalation”, quality_score=1.0) — the full attempt+failure+solution+diff entry. Awards the +1 indexing bonus and applies the −5 escalation penalty.</w:t>
+      </w:r>
+    </w:p>
+    <w:p>
+      <w:pPr>
+        <w:pStyle w:val="ListParagraph"/>
+        <w:numPr>
+          <w:ilvl w:val="0"/>
+          <w:numId w:val="2"/>
+        </w:numPr>
+        <w:spacing w:after="40" w:before="40"/>
+      </w:pPr>
+      <w:r>
+        <w:rPr>
+          <w:rFonts w:ascii="Arial" w:cs="Arial" w:eastAsia="Arial" w:hAnsi="Arial"/>
+          <w:b/>
+          <w:bCs/>
+          <w:color w:val="000000"/>
+          <w:sz w:val="22"/>
+          <w:szCs w:val="22"/>
+        </w:rPr>
+        <w:t xml:space="preserve">Post-episode:</w:t>
+      </w:r>
+      <w:r>
+        <w:rPr>
+          <w:rFonts w:ascii="Arial" w:cs="Arial" w:eastAsia="Arial" w:hAnsi="Arial"/>
+          <w:color w:val="000000"/>
+          <w:sz w:val="22"/>
+          <w:szCs w:val="22"/>
+        </w:rPr>
+        <w:t xml:space="preserve"> record_outcome(doc_id, success, note) — updates empirical_runs and empirical_failures on any KB document that was retrieved and used. This drives quality_score evolution over time via the confirmation_weight factor.</w:t>
+      </w:r>
+    </w:p>
+    <w:p>
+      <w:pPr>
+        <w:pStyle w:val="Heading2"/>
+        <w:spacing w:after="80" w:before="240"/>
+      </w:pPr>
+      <w:r>
+        <w:rPr>
+          <w:rFonts w:ascii="Arial" w:cs="Arial" w:eastAsia="Arial" w:hAnsi="Arial"/>
+          <w:b/>
+          <w:bCs/>
+          <w:color w:val="1F4E79"/>
+          <w:sz w:val="26"/>
+          <w:szCs w:val="26"/>
+        </w:rPr>
+        <w:t xml:space="preserve">7.5  Reward Structure as KB Contribution Incentive</w:t>
+      </w:r>
+    </w:p>
+    <w:p>
+      <w:pPr>
+        <w:spacing w:after="80" w:before="60"/>
+      </w:pPr>
+      <w:r>
+        <w:rPr>
+          <w:rFonts w:ascii="Arial" w:cs="Arial" w:eastAsia="Arial" w:hAnsi="Arial"/>
+          <w:color w:val="000000"/>
+          <w:sz w:val="22"/>
+          <w:szCs w:val="22"/>
+        </w:rPr>
+        <w:t xml:space="preserve">The arena point structure creates three distinct KB-related incentives. These are not incidental — they are the mechanism by which the game-theory layer drives KB quality growth:</w:t>
+      </w:r>
+    </w:p>
+    <w:p>
+      <w:pPr>
+        <w:pStyle w:val="Heading3"/>
+        <w:spacing w:after="60" w:before="180"/>
+      </w:pPr>
+      <w:r>
+        <w:rPr>
+          <w:rFonts w:ascii="Arial" w:cs="Arial" w:eastAsia="Arial" w:hAnsi="Arial"/>
+          <w:b/>
+          <w:bCs/>
+          <w:color w:val="595959"/>
+          <w:sz w:val="24"/>
+          <w:szCs w:val="24"/>
+        </w:rPr>
+        <w:t xml:space="preserve">Complete Point Assignment and Discipline Multipliers</w:t>
+      </w:r>
+    </w:p>
+    <w:p>
+      <w:pPr>
+        <w:spacing w:after="80" w:before="60"/>
+      </w:pPr>
+      <w:r>
+        <w:rPr>
+          <w:rFonts w:ascii="Arial" w:cs="Arial" w:eastAsia="Arial" w:hAnsi="Arial"/>
+          <w:color w:val="000000"/>
+          <w:sz w:val="22"/>
+          <w:szCs w:val="22"/>
+        </w:rPr>
+        <w:t xml:space="preserve">Base points per episode event (before discipline multiplier is applied):</w:t>
+      </w:r>
+    </w:p>
+    <w:tbl>
+      <w:tblPr>
+        <w:tblW w:type="dxa" w:w="9360"/>
+        <w:tblBorders>
+          <w:top w:val="single" w:color="CCCCCC" w:sz="1"/>
+          <w:left w:val="single" w:color="CCCCCC" w:sz="1"/>
+          <w:bottom w:val="single" w:color="CCCCCC" w:sz="1"/>
+          <w:right w:val="single" w:color="CCCCCC" w:sz="1"/>
+          <w:insideH w:val="single" w:color="CCCCCC" w:sz="1"/>
+          <w:insideV w:val="single" w:color="CCCCCC" w:sz="1"/>
+        </w:tblBorders>
+        <w:tblCellMar>
+          <w:top w:type="dxa" w:w="70"/>
+          <w:left w:type="dxa" w:w="120"/>
+          <w:bottom w:type="dxa" w:w="70"/>
+          <w:right w:type="dxa" w:w="120"/>
+        </w:tblCellMar>
+      </w:tblPr>
+      <w:tblGrid>
+        <w:gridCol w:w="6840"/>
+        <w:gridCol w:w="2520"/>
+      </w:tblGrid>
+      <w:tr>
+        <w:trPr>
+          <w:tblHeader/>
+        </w:trPr>
+        <w:tc>
+          <w:tcPr>
+            <w:tcW w:type="dxa" w:w="6840"/>
+            <w:shd w:fill="1F4E79" w:val="clear"/>
+          </w:tcPr>
+          <w:p>
+            <w:r>
+              <w:rPr>
+                <w:rFonts w:ascii="Arial" w:cs="Arial" w:eastAsia="Arial" w:hAnsi="Arial"/>
+                <w:b/>
+                <w:bCs/>
+                <w:color w:val="FFFFFF"/>
+                <w:sz w:val="20"/>
+                <w:szCs w:val="20"/>
+              </w:rPr>
+              <w:t xml:space="preserve">Event</w:t>
+            </w:r>
+          </w:p>
+        </w:tc>
+        <w:tc>
+          <w:tcPr>
+            <w:tcW w:type="dxa" w:w="2520"/>
+            <w:shd w:fill="1F4E79" w:val="clear"/>
+          </w:tcPr>
+          <w:p>
+            <w:r>
+              <w:rPr>
+                <w:rFonts w:ascii="Arial" w:cs="Arial" w:eastAsia="Arial" w:hAnsi="Arial"/>
+                <w:b/>
+                <w:bCs/>
+                <w:color w:val="FFFFFF"/>
+                <w:sz w:val="20"/>
+                <w:szCs w:val="20"/>
+              </w:rPr>
+              <w:t xml:space="preserve">Points</w:t>
+            </w:r>
+          </w:p>
+        </w:tc>
+      </w:tr>
+      <w:tr>
+        <w:tc>
+          <w:tcPr>
+            <w:tcW w:type="dxa" w:w="6840"/>
+            <w:shd w:fill="D9E2F3" w:val="clear"/>
+          </w:tcPr>
+          <w:p>
+            <w:r>
+              <w:rPr>
+                <w:rFonts w:ascii="Arial" w:cs="Arial" w:eastAsia="Arial" w:hAnsi="Arial"/>
+                <w:color w:val="000000"/>
+                <w:sz w:val="20"/>
+                <w:szCs w:val="20"/>
+              </w:rPr>
+              <w:t xml:space="preserve">Solve on attempt 1</w:t>
+            </w:r>
+          </w:p>
+        </w:tc>
+        <w:tc>
+          <w:tcPr>
+            <w:tcW w:type="dxa" w:w="2520"/>
+            <w:shd w:fill="D9E2F3" w:val="clear"/>
+          </w:tcPr>
+          <w:p>
+            <w:r>
+              <w:rPr>
+                <w:rFonts w:ascii="Arial" w:cs="Arial" w:eastAsia="Arial" w:hAnsi="Arial"/>
+                <w:b/>
+                <w:bCs/>
+                <w:color w:val="1F4E79"/>
+                <w:sz w:val="20"/>
+                <w:szCs w:val="20"/>
+              </w:rPr>
+              <w:t xml:space="preserve">+10</w:t>
+            </w:r>
+          </w:p>
+        </w:tc>
+      </w:tr>
+      <w:tr>
+        <w:tc>
+          <w:tcPr>
+            <w:tcW w:type="dxa" w:w="6840"/>
+            <w:shd w:fill="FFFFFF" w:val="clear"/>
+          </w:tcPr>
+          <w:p>
+            <w:r>
+              <w:rPr>
+                <w:rFonts w:ascii="Arial" w:cs="Arial" w:eastAsia="Arial" w:hAnsi="Arial"/>
+                <w:color w:val="000000"/>
+                <w:sz w:val="20"/>
+                <w:szCs w:val="20"/>
+              </w:rPr>
+              <w:t xml:space="preserve">Solve on attempt 2</w:t>
+            </w:r>
+          </w:p>
+        </w:tc>
+        <w:tc>
+          <w:tcPr>
+            <w:tcW w:type="dxa" w:w="2520"/>
+            <w:shd w:fill="FFFFFF" w:val="clear"/>
+          </w:tcPr>
+          <w:p>
+            <w:r>
+              <w:rPr>
+                <w:rFonts w:ascii="Arial" w:cs="Arial" w:eastAsia="Arial" w:hAnsi="Arial"/>
+                <w:b/>
+                <w:bCs/>
+                <w:color w:val="1F4E79"/>
+                <w:sz w:val="20"/>
+                <w:szCs w:val="20"/>
+              </w:rPr>
+              <w:t xml:space="preserve">+7</w:t>
+            </w:r>
+          </w:p>
+        </w:tc>
+      </w:tr>
+      <w:tr>
+        <w:tc>
+          <w:tcPr>
+            <w:tcW w:type="dxa" w:w="6840"/>
+            <w:shd w:fill="D9E2F3" w:val="clear"/>
+          </w:tcPr>
+          <w:p>
+            <w:r>
+              <w:rPr>
+                <w:rFonts w:ascii="Arial" w:cs="Arial" w:eastAsia="Arial" w:hAnsi="Arial"/>
+                <w:color w:val="000000"/>
+                <w:sz w:val="20"/>
+                <w:szCs w:val="20"/>
+              </w:rPr>
+              <w:t xml:space="preserve">Solve on attempt 3</w:t>
+            </w:r>
+          </w:p>
+        </w:tc>
+        <w:tc>
+          <w:tcPr>
+            <w:tcW w:type="dxa" w:w="2520"/>
+            <w:shd w:fill="D9E2F3" w:val="clear"/>
+          </w:tcPr>
+          <w:p>
+            <w:r>
+              <w:rPr>
+                <w:rFonts w:ascii="Arial" w:cs="Arial" w:eastAsia="Arial" w:hAnsi="Arial"/>
+                <w:b/>
+                <w:bCs/>
+                <w:color w:val="1F4E79"/>
+                <w:sz w:val="20"/>
+                <w:szCs w:val="20"/>
+              </w:rPr>
+              <w:t xml:space="preserve">+4</w:t>
+            </w:r>
+          </w:p>
+        </w:tc>
+      </w:tr>
+      <w:tr>
+        <w:tc>
+          <w:tcPr>
+            <w:tcW w:type="dxa" w:w="6840"/>
+            <w:shd w:fill="FFFFFF" w:val="clear"/>
+          </w:tcPr>
+          <w:p>
+            <w:r>
+              <w:rPr>
+                <w:rFonts w:ascii="Arial" w:cs="Arial" w:eastAsia="Arial" w:hAnsi="Arial"/>
+                <w:color w:val="000000"/>
+                <w:sz w:val="20"/>
+                <w:szCs w:val="20"/>
+              </w:rPr>
+              <w:t xml:space="preserve">Solve after escalation (useful context provided)</w:t>
+            </w:r>
+          </w:p>
+        </w:tc>
+        <w:tc>
+          <w:tcPr>
+            <w:tcW w:type="dxa" w:w="2520"/>
+            <w:shd w:fill="FFFFFF" w:val="clear"/>
+          </w:tcPr>
+          <w:p>
+            <w:r>
+              <w:rPr>
+                <w:rFonts w:ascii="Arial" w:cs="Arial" w:eastAsia="Arial" w:hAnsi="Arial"/>
+                <w:b/>
+                <w:bCs/>
+                <w:color w:val="1F4E79"/>
+                <w:sz w:val="20"/>
+                <w:szCs w:val="20"/>
+              </w:rPr>
+              <w:t xml:space="preserve">+2</w:t>
+            </w:r>
+          </w:p>
+        </w:tc>
+      </w:tr>
+      <w:tr>
+        <w:tc>
+          <w:tcPr>
+            <w:tcW w:type="dxa" w:w="6840"/>
+            <w:shd w:fill="D9E2F3" w:val="clear"/>
+          </w:tcPr>
+          <w:p>
+            <w:r>
+              <w:rPr>
+                <w:rFonts w:ascii="Arial" w:cs="Arial" w:eastAsia="Arial" w:hAnsi="Arial"/>
+                <w:color w:val="000000"/>
+                <w:sz w:val="20"/>
+                <w:szCs w:val="20"/>
+              </w:rPr>
+              <w:t xml:space="preserve">Escalation triggered</w:t>
+            </w:r>
+          </w:p>
+        </w:tc>
+        <w:tc>
+          <w:tcPr>
+            <w:tcW w:type="dxa" w:w="2520"/>
+            <w:shd w:fill="D9E2F3" w:val="clear"/>
+          </w:tcPr>
+          <w:p>
+            <w:r>
+              <w:rPr>
+                <w:rFonts w:ascii="Arial" w:cs="Arial" w:eastAsia="Arial" w:hAnsi="Arial"/>
+                <w:b/>
+                <w:bCs/>
+                <w:color w:val="C00000"/>
+                <w:sz w:val="20"/>
+                <w:szCs w:val="20"/>
+              </w:rPr>
+              <w:t xml:space="preserve">−5</w:t>
+            </w:r>
+          </w:p>
+        </w:tc>
+      </w:tr>
+      <w:tr>
+        <w:tc>
+          <w:tcPr>
+            <w:tcW w:type="dxa" w:w="6840"/>
+            <w:shd w:fill="FFFFFF" w:val="clear"/>
+          </w:tcPr>
+          <w:p>
+            <w:r>
+              <w:rPr>
+                <w:rFonts w:ascii="Arial" w:cs="Arial" w:eastAsia="Arial" w:hAnsi="Arial"/>
+                <w:color w:val="000000"/>
+                <w:sz w:val="20"/>
+                <w:szCs w:val="20"/>
+              </w:rPr>
+              <w:t xml:space="preserve">KB hit retrieved and used in solution</w:t>
+            </w:r>
+          </w:p>
+        </w:tc>
+        <w:tc>
+          <w:tcPr>
+            <w:tcW w:type="dxa" w:w="2520"/>
+            <w:shd w:fill="FFFFFF" w:val="clear"/>
+          </w:tcPr>
+          <w:p>
+            <w:r>
+              <w:rPr>
+                <w:rFonts w:ascii="Arial" w:cs="Arial" w:eastAsia="Arial" w:hAnsi="Arial"/>
+                <w:b/>
+                <w:bCs/>
+                <w:color w:val="375623"/>
+                <w:sz w:val="20"/>
+                <w:szCs w:val="20"/>
+              </w:rPr>
+              <w:t xml:space="preserve">+2 bonus</w:t>
+            </w:r>
+          </w:p>
+        </w:tc>
+      </w:tr>
+      <w:tr>
+        <w:tc>
+          <w:tcPr>
+            <w:tcW w:type="dxa" w:w="6840"/>
+            <w:shd w:fill="D9E2F3" w:val="clear"/>
+          </w:tcPr>
+          <w:p>
+            <w:r>
+              <w:rPr>
+                <w:rFonts w:ascii="Arial" w:cs="Arial" w:eastAsia="Arial" w:hAnsi="Arial"/>
+                <w:color w:val="000000"/>
+                <w:sz w:val="20"/>
+                <w:szCs w:val="20"/>
+              </w:rPr>
+              <w:t xml:space="preserve">Solution successfully indexed to KB</w:t>
+            </w:r>
+          </w:p>
+        </w:tc>
+        <w:tc>
+          <w:tcPr>
+            <w:tcW w:type="dxa" w:w="2520"/>
+            <w:shd w:fill="D9E2F3" w:val="clear"/>
+          </w:tcPr>
+          <w:p>
+            <w:r>
+              <w:rPr>
+                <w:rFonts w:ascii="Arial" w:cs="Arial" w:eastAsia="Arial" w:hAnsi="Arial"/>
+                <w:b/>
+                <w:bCs/>
+                <w:color w:val="375623"/>
+                <w:sz w:val="20"/>
+                <w:szCs w:val="20"/>
+              </w:rPr>
+              <w:t xml:space="preserve">+1</w:t>
+            </w:r>
+          </w:p>
+        </w:tc>
+      </w:tr>
+      <w:tr>
+        <w:tc>
+          <w:tcPr>
+            <w:tcW w:type="dxa" w:w="6840"/>
+            <w:shd w:fill="FFFFFF" w:val="clear"/>
+          </w:tcPr>
+          <w:p>
+            <w:r>
+              <w:rPr>
+                <w:rFonts w:ascii="Arial" w:cs="Arial" w:eastAsia="Arial" w:hAnsi="Arial"/>
+                <w:color w:val="000000"/>
+                <w:sz w:val="20"/>
+                <w:szCs w:val="20"/>
+              </w:rPr>
+              <w:t xml:space="preserve">Rollback defined before any mutation</w:t>
+            </w:r>
+          </w:p>
+        </w:tc>
+        <w:tc>
+          <w:tcPr>
+            <w:tcW w:type="dxa" w:w="2520"/>
+            <w:shd w:fill="FFFFFF" w:val="clear"/>
+          </w:tcPr>
+          <w:p>
+            <w:r>
+              <w:rPr>
+                <w:rFonts w:ascii="Arial" w:cs="Arial" w:eastAsia="Arial" w:hAnsi="Arial"/>
+                <w:b/>
+                <w:bCs/>
+                <w:color w:val="375623"/>
+                <w:sz w:val="20"/>
+                <w:szCs w:val="20"/>
+              </w:rPr>
+              <w:t xml:space="preserve">+1</w:t>
+            </w:r>
+          </w:p>
+        </w:tc>
+      </w:tr>
+      <w:tr>
+        <w:tc>
+          <w:tcPr>
+            <w:tcW w:type="dxa" w:w="6840"/>
+            <w:shd w:fill="D9E2F3" w:val="clear"/>
+          </w:tcPr>
+          <w:p>
+            <w:r>
+              <w:rPr>
+                <w:rFonts w:ascii="Arial" w:cs="Arial" w:eastAsia="Arial" w:hAnsi="Arial"/>
+                <w:color w:val="000000"/>
+                <w:sz w:val="20"/>
+                <w:szCs w:val="20"/>
+              </w:rPr>
+              <w:t xml:space="preserve">Post-run health check passed</w:t>
+            </w:r>
+          </w:p>
+        </w:tc>
+        <w:tc>
+          <w:tcPr>
+            <w:tcW w:type="dxa" w:w="2520"/>
+            <w:shd w:fill="D9E2F3" w:val="clear"/>
+          </w:tcPr>
+          <w:p>
+            <w:r>
+              <w:rPr>
+                <w:rFonts w:ascii="Arial" w:cs="Arial" w:eastAsia="Arial" w:hAnsi="Arial"/>
+                <w:b/>
+                <w:bCs/>
+                <w:color w:val="375623"/>
+                <w:sz w:val="20"/>
+                <w:szCs w:val="20"/>
+              </w:rPr>
+              <w:t xml:space="preserve">+1</w:t>
+            </w:r>
+          </w:p>
+        </w:tc>
+      </w:tr>
+    </w:tbl>
+    <w:p>
+      <w:pPr>
+        <w:spacing w:after="80" w:before="60"/>
+      </w:pPr>
+      <w:r>
+        <w:rPr>
+          <w:rFonts w:ascii="Arial" w:cs="Arial" w:eastAsia="Arial" w:hAnsi="Arial"/>
+          <w:color w:val="000000"/>
+          <w:sz w:val="22"/>
+          <w:szCs w:val="22"/>
+        </w:rPr>
+        <w:t xml:space="preserve">Discipline multipliers (applied to total points for the episode):</w:t>
+      </w:r>
+    </w:p>
+    <w:tbl>
+      <w:tblPr>
+        <w:tblW w:type="dxa" w:w="9360"/>
+        <w:tblBorders>
+          <w:top w:val="single" w:color="CCCCCC" w:sz="1"/>
+          <w:left w:val="single" w:color="CCCCCC" w:sz="1"/>
+          <w:bottom w:val="single" w:color="CCCCCC" w:sz="1"/>
+          <w:right w:val="single" w:color="CCCCCC" w:sz="1"/>
+          <w:insideH w:val="single" w:color="CCCCCC" w:sz="1"/>
+          <w:insideV w:val="single" w:color="CCCCCC" w:sz="1"/>
+        </w:tblBorders>
+        <w:tblCellMar>
+          <w:top w:type="dxa" w:w="70"/>
+          <w:left w:type="dxa" w:w="120"/>
+          <w:bottom w:type="dxa" w:w="70"/>
+          <w:right w:type="dxa" w:w="120"/>
+        </w:tblCellMar>
+      </w:tblPr>
+      <w:tblGrid>
+        <w:gridCol w:w="3600"/>
+        <w:gridCol w:w="1800"/>
+        <w:gridCol w:w="3960"/>
+      </w:tblGrid>
+      <w:tr>
+        <w:trPr>
+          <w:tblHeader/>
+        </w:trPr>
+        <w:tc>
+          <w:tcPr>
+            <w:tcW w:type="dxa" w:w="3600"/>
+            <w:shd w:fill="1F4E79" w:val="clear"/>
+          </w:tcPr>
+          <w:p>
+            <w:r>
+              <w:rPr>
+                <w:rFonts w:ascii="Arial" w:cs="Arial" w:eastAsia="Arial" w:hAnsi="Arial"/>
+                <w:b/>
+                <w:bCs/>
+                <w:color w:val="FFFFFF"/>
+                <w:sz w:val="20"/>
+                <w:szCs w:val="20"/>
+              </w:rPr>
+              <w:t xml:space="preserve">Discipline</w:t>
+            </w:r>
+          </w:p>
+        </w:tc>
+        <w:tc>
+          <w:tcPr>
+            <w:tcW w:type="dxa" w:w="1800"/>
+            <w:shd w:fill="1F4E79" w:val="clear"/>
+          </w:tcPr>
+          <w:p>
+            <w:r>
+              <w:rPr>
+                <w:rFonts w:ascii="Arial" w:cs="Arial" w:eastAsia="Arial" w:hAnsi="Arial"/>
+                <w:b/>
+                <w:bCs/>
+                <w:color w:val="FFFFFF"/>
+                <w:sz w:val="20"/>
+                <w:szCs w:val="20"/>
+              </w:rPr>
+              <w:t xml:space="preserve">Multiplier</w:t>
+            </w:r>
+          </w:p>
+        </w:tc>
+        <w:tc>
+          <w:tcPr>
+            <w:tcW w:type="dxa" w:w="3960"/>
+            <w:shd w:fill="1F4E79" w:val="clear"/>
+          </w:tcPr>
+          <w:p>
+            <w:r>
+              <w:rPr>
+                <w:rFonts w:ascii="Arial" w:cs="Arial" w:eastAsia="Arial" w:hAnsi="Arial"/>
+                <w:b/>
+                <w:bCs/>
+                <w:color w:val="FFFFFF"/>
+                <w:sz w:val="20"/>
+                <w:szCs w:val="20"/>
+              </w:rPr>
+              <w:t xml:space="preserve">Rationale</w:t>
+            </w:r>
+          </w:p>
+        </w:tc>
+      </w:tr>
+      <w:tr>
+        <w:tc>
+          <w:tcPr>
+            <w:tcW w:type="dxa" w:w="3600"/>
+            <w:shd w:fill="D9E2F3" w:val="clear"/>
+          </w:tcPr>
+          <w:p>
+            <w:r>
+              <w:rPr>
+                <w:rFonts w:ascii="Arial" w:cs="Arial" w:eastAsia="Arial" w:hAnsi="Arial"/>
+                <w:color w:val="000000"/>
+                <w:sz w:val="20"/>
+                <w:szCs w:val="20"/>
+              </w:rPr>
+              <w:t xml:space="preserve">Debugging</w:t>
+            </w:r>
+          </w:p>
+        </w:tc>
+        <w:tc>
+          <w:tcPr>
+            <w:tcW w:type="dxa" w:w="1800"/>
+            <w:shd w:fill="D9E2F3" w:val="clear"/>
+          </w:tcPr>
+          <w:p>
+            <w:r>
+              <w:rPr>
+                <w:rFonts w:ascii="Arial" w:cs="Arial" w:eastAsia="Arial" w:hAnsi="Arial"/>
+                <w:b/>
+                <w:bCs/>
+                <w:color w:val="1F4E79"/>
+                <w:sz w:val="20"/>
+                <w:szCs w:val="20"/>
+              </w:rPr>
+              <w:t xml:space="preserve">1.5×</w:t>
+            </w:r>
+          </w:p>
+        </w:tc>
+        <w:tc>
+          <w:tcPr>
+            <w:tcW w:type="dxa" w:w="3960"/>
+            <w:shd w:fill="D9E2F3" w:val="clear"/>
+          </w:tcPr>
+          <w:p>
+            <w:r>
+              <w:rPr>
+                <w:rFonts w:ascii="Arial" w:cs="Arial" w:eastAsia="Arial" w:hAnsi="Arial"/>
+                <w:color w:val="000000"/>
+                <w:sz w:val="20"/>
+                <w:szCs w:val="20"/>
+              </w:rPr>
+              <w:t xml:space="preserve">Hardest to fake; requires hypothesis formation under incomplete information</w:t>
+            </w:r>
+          </w:p>
+        </w:tc>
+      </w:tr>
+      <w:tr>
+        <w:tc>
+          <w:tcPr>
+            <w:tcW w:type="dxa" w:w="3600"/>
+            <w:shd w:fill="FFFFFF" w:val="clear"/>
+          </w:tcPr>
+          <w:p>
+            <w:r>
+              <w:rPr>
+                <w:rFonts w:ascii="Arial" w:cs="Arial" w:eastAsia="Arial" w:hAnsi="Arial"/>
+                <w:color w:val="000000"/>
+                <w:sz w:val="20"/>
+                <w:szCs w:val="20"/>
+              </w:rPr>
+              <w:t xml:space="preserve">Security analysis</w:t>
+            </w:r>
+          </w:p>
+        </w:tc>
+        <w:tc>
+          <w:tcPr>
+            <w:tcW w:type="dxa" w:w="1800"/>
+            <w:shd w:fill="FFFFFF" w:val="clear"/>
+          </w:tcPr>
+          <w:p>
+            <w:r>
+              <w:rPr>
+                <w:rFonts w:ascii="Arial" w:cs="Arial" w:eastAsia="Arial" w:hAnsi="Arial"/>
+                <w:b/>
+                <w:bCs/>
+                <w:color w:val="1F4E79"/>
+                <w:sz w:val="20"/>
+                <w:szCs w:val="20"/>
+              </w:rPr>
+              <w:t xml:space="preserve">1.3×</w:t>
+            </w:r>
+          </w:p>
+        </w:tc>
+        <w:tc>
+          <w:tcPr>
+            <w:tcW w:type="dxa" w:w="3960"/>
+            <w:shd w:fill="FFFFFF" w:val="clear"/>
+          </w:tcPr>
+          <w:p>
+            <w:r>
+              <w:rPr>
+                <w:rFonts w:ascii="Arial" w:cs="Arial" w:eastAsia="Arial" w:hAnsi="Arial"/>
+                <w:color w:val="000000"/>
+                <w:sz w:val="20"/>
+                <w:szCs w:val="20"/>
+              </w:rPr>
+              <w:t xml:space="preserve">Privilege boundary reasoning; maps to LSE permission model</w:t>
+            </w:r>
+          </w:p>
+        </w:tc>
+      </w:tr>
+      <w:tr>
+        <w:tc>
+          <w:tcPr>
+            <w:tcW w:type="dxa" w:w="3600"/>
+            <w:shd w:fill="D9E2F3" w:val="clear"/>
+          </w:tcPr>
+          <w:p>
+            <w:r>
+              <w:rPr>
+                <w:rFonts w:ascii="Arial" w:cs="Arial" w:eastAsia="Arial" w:hAnsi="Arial"/>
+                <w:color w:val="000000"/>
+                <w:sz w:val="20"/>
+                <w:szCs w:val="20"/>
+              </w:rPr>
+              <w:t xml:space="preserve">Constraint satisfaction</w:t>
+            </w:r>
+          </w:p>
+        </w:tc>
+        <w:tc>
+          <w:tcPr>
+            <w:tcW w:type="dxa" w:w="1800"/>
+            <w:shd w:fill="D9E2F3" w:val="clear"/>
+          </w:tcPr>
+          <w:p>
+            <w:r>
+              <w:rPr>
+                <w:rFonts w:ascii="Arial" w:cs="Arial" w:eastAsia="Arial" w:hAnsi="Arial"/>
+                <w:b/>
+                <w:bCs/>
+                <w:color w:val="1F4E79"/>
+                <w:sz w:val="20"/>
+                <w:szCs w:val="20"/>
+              </w:rPr>
+              <w:t xml:space="preserve">1.3×</w:t>
+            </w:r>
+          </w:p>
+        </w:tc>
+        <w:tc>
+          <w:tcPr>
+            <w:tcW w:type="dxa" w:w="3960"/>
+            <w:shd w:fill="D9E2F3" w:val="clear"/>
+          </w:tcPr>
+          <w:p>
+            <w:r>
+              <w:rPr>
+                <w:rFonts w:ascii="Arial" w:cs="Arial" w:eastAsia="Arial" w:hAnsi="Arial"/>
+                <w:color w:val="000000"/>
+                <w:sz w:val="20"/>
+                <w:szCs w:val="20"/>
+              </w:rPr>
+              <w:t xml:space="preserve">Staying within boundaries under pressure; most common LSE eval failure</w:t>
+            </w:r>
+          </w:p>
+        </w:tc>
+      </w:tr>
+      <w:tr>
+        <w:tc>
+          <w:tcPr>
+            <w:tcW w:type="dxa" w:w="3600"/>
+            <w:shd w:fill="FFFFFF" w:val="clear"/>
+          </w:tcPr>
+          <w:p>
+            <w:r>
+              <w:rPr>
+                <w:rFonts w:ascii="Arial" w:cs="Arial" w:eastAsia="Arial" w:hAnsi="Arial"/>
+                <w:color w:val="000000"/>
+                <w:sz w:val="20"/>
+                <w:szCs w:val="20"/>
+              </w:rPr>
+              <w:t xml:space="preserve">Coding</w:t>
+            </w:r>
+          </w:p>
+        </w:tc>
+        <w:tc>
+          <w:tcPr>
+            <w:tcW w:type="dxa" w:w="1800"/>
+            <w:shd w:fill="FFFFFF" w:val="clear"/>
+          </w:tcPr>
+          <w:p>
+            <w:r>
+              <w:rPr>
+                <w:rFonts w:ascii="Arial" w:cs="Arial" w:eastAsia="Arial" w:hAnsi="Arial"/>
+                <w:b/>
+                <w:bCs/>
+                <w:color w:val="1F4E79"/>
+                <w:sz w:val="20"/>
+                <w:szCs w:val="20"/>
+              </w:rPr>
+              <w:t xml:space="preserve">1.2×</w:t>
+            </w:r>
+          </w:p>
+        </w:tc>
+        <w:tc>
+          <w:tcPr>
+            <w:tcW w:type="dxa" w:w="3960"/>
+            <w:shd w:fill="FFFFFF" w:val="clear"/>
+          </w:tcPr>
+          <w:p>
+            <w:r>
+              <w:rPr>
+                <w:rFonts w:ascii="Arial" w:cs="Arial" w:eastAsia="Arial" w:hAnsi="Arial"/>
+                <w:color w:val="000000"/>
+                <w:sz w:val="20"/>
+                <w:szCs w:val="20"/>
+              </w:rPr>
+              <w:t xml:space="preserve">Script and automation authorship</w:t>
+            </w:r>
+          </w:p>
+        </w:tc>
+      </w:tr>
+      <w:tr>
+        <w:tc>
+          <w:tcPr>
+            <w:tcW w:type="dxa" w:w="3600"/>
+            <w:shd w:fill="D9E2F3" w:val="clear"/>
+          </w:tcPr>
+          <w:p>
+            <w:r>
+              <w:rPr>
+                <w:rFonts w:ascii="Arial" w:cs="Arial" w:eastAsia="Arial" w:hAnsi="Arial"/>
+                <w:color w:val="000000"/>
+                <w:sz w:val="20"/>
+                <w:szCs w:val="20"/>
+              </w:rPr>
+              <w:t xml:space="preserve">Performance optimization</w:t>
+            </w:r>
+          </w:p>
+        </w:tc>
+        <w:tc>
+          <w:tcPr>
+            <w:tcW w:type="dxa" w:w="1800"/>
+            <w:shd w:fill="D9E2F3" w:val="clear"/>
+          </w:tcPr>
+          <w:p>
+            <w:r>
+              <w:rPr>
+                <w:rFonts w:ascii="Arial" w:cs="Arial" w:eastAsia="Arial" w:hAnsi="Arial"/>
+                <w:b/>
+                <w:bCs/>
+                <w:color w:val="1F4E79"/>
+                <w:sz w:val="20"/>
+                <w:szCs w:val="20"/>
+              </w:rPr>
+              <w:t xml:space="preserve">1.1×</w:t>
+            </w:r>
+          </w:p>
+        </w:tc>
+        <w:tc>
+          <w:tcPr>
+            <w:tcW w:type="dxa" w:w="3960"/>
+            <w:shd w:fill="D9E2F3" w:val="clear"/>
+          </w:tcPr>
+          <w:p>
+            <w:r>
+              <w:rPr>
+                <w:rFonts w:ascii="Arial" w:cs="Arial" w:eastAsia="Arial" w:hAnsi="Arial"/>
+                <w:color w:val="000000"/>
+                <w:sz w:val="20"/>
+                <w:szCs w:val="20"/>
+              </w:rPr>
+              <w:t xml:space="preserve">Bottleneck identification; measurement-driven</w:t>
+            </w:r>
+          </w:p>
+        </w:tc>
+      </w:tr>
+      <w:tr>
+        <w:tc>
+          <w:tcPr>
+            <w:tcW w:type="dxa" w:w="3600"/>
+            <w:shd w:fill="FFFFFF" w:val="clear"/>
+          </w:tcPr>
+          <w:p>
+            <w:r>
+              <w:rPr>
+                <w:rFonts w:ascii="Arial" w:cs="Arial" w:eastAsia="Arial" w:hAnsi="Arial"/>
+                <w:color w:val="000000"/>
+                <w:sz w:val="20"/>
+                <w:szCs w:val="20"/>
+              </w:rPr>
+              <w:t xml:space="preserve">System administration</w:t>
+            </w:r>
+          </w:p>
+        </w:tc>
+        <w:tc>
+          <w:tcPr>
+            <w:tcW w:type="dxa" w:w="1800"/>
+            <w:shd w:fill="FFFFFF" w:val="clear"/>
+          </w:tcPr>
+          <w:p>
+            <w:r>
+              <w:rPr>
+                <w:rFonts w:ascii="Arial" w:cs="Arial" w:eastAsia="Arial" w:hAnsi="Arial"/>
+                <w:color w:val="000000"/>
+                <w:sz w:val="20"/>
+                <w:szCs w:val="20"/>
+              </w:rPr>
+              <w:t xml:space="preserve">1.0×</w:t>
+            </w:r>
+          </w:p>
+        </w:tc>
+        <w:tc>
+          <w:tcPr>
+            <w:tcW w:type="dxa" w:w="3960"/>
+            <w:shd w:fill="FFFFFF" w:val="clear"/>
+          </w:tcPr>
+          <w:p>
+            <w:r>
+              <w:rPr>
+                <w:rFonts w:ascii="Arial" w:cs="Arial" w:eastAsia="Arial" w:hAnsi="Arial"/>
+                <w:color w:val="000000"/>
+                <w:sz w:val="20"/>
+                <w:szCs w:val="20"/>
+              </w:rPr>
+              <w:t xml:space="preserve">Baseline — standard ops work</w:t>
+            </w:r>
+          </w:p>
+        </w:tc>
+      </w:tr>
+    </w:tbl>
+    <w:p>
+      <w:pPr>
+        <w:spacing w:after="80" w:before="60"/>
+      </w:pPr>
+      <w:r>
+        <w:rPr>
+          <w:rFonts w:ascii="Arial" w:cs="Arial" w:eastAsia="Arial" w:hAnsi="Arial"/>
+          <w:color w:val="000000"/>
+          <w:sz w:val="22"/>
+          <w:szCs w:val="22"/>
+        </w:rPr>
+        <w:t xml:space="preserve">PhD threshold: 1,000 points unlocks the next difficulty tier. It does NOT terminate participation — removing the highest-performing models at threshold would destroy the incentive structure at precisely the moment they are most valuable to KB enrichment.</w:t>
+      </w:r>
+    </w:p>
+    <w:p>
+      <w:pPr>
+        <w:spacing w:after="80" w:before="60"/>
+      </w:pPr>
+      <w:r>
+        <w:rPr>
+          <w:rFonts w:ascii="Arial" w:cs="Arial" w:eastAsia="Arial" w:hAnsi="Arial"/>
+          <w:color w:val="000000"/>
+          <w:sz w:val="22"/>
+          <w:szCs w:val="22"/>
+        </w:rPr>
+        <w:t xml:space="preserve">Claude API escalation cost: −5 (penalty — Claude API call only) + 1 (indexing bonus) + up to 2 (context quality bonus) = net −4 to −2. Web search (step 4) carries zero penalty — it is mandatory infrastructure, not escalation. The −5 penalty applies solely to the Claude API call. Deliberately not catastrophic: a model that escalates cleanly after three genuine attempts and a web search loses fewer net points than one that makes three poor attempts and escalates with weak context, because the latter earns neither the solve bonus nor the context quality bonus. The scoring makes clean escalation the rational choice.</w:t>
+      </w:r>
+    </w:p>
+    <w:p>
+      <w:pPr>
+        <w:pStyle w:val="ListParagraph"/>
+        <w:numPr>
+          <w:ilvl w:val="0"/>
+          <w:numId w:val="2"/>
+        </w:numPr>
+        <w:spacing w:after="40" w:before="40"/>
+      </w:pPr>
+      <w:r>
+        <w:rPr>
+          <w:rFonts w:ascii="Arial" w:cs="Arial" w:eastAsia="Arial" w:hAnsi="Arial"/>
+          <w:b/>
+          <w:bCs/>
+          <w:color w:val="000000"/>
+          <w:sz w:val="22"/>
+          <w:szCs w:val="22"/>
+        </w:rPr>
+        <w:t xml:space="preserve">+2 KB hit bonus:</w:t>
+      </w:r>
+      <w:r>
+        <w:rPr>
+          <w:rFonts w:ascii="Arial" w:cs="Arial" w:eastAsia="Arial" w:hAnsi="Arial"/>
+          <w:color w:val="000000"/>
+          <w:sz w:val="22"/>
+          <w:szCs w:val="22"/>
+        </w:rPr>
+        <w:t xml:space="preserve"> Rewards KB retrieval and use. Creates selection pressure for models to query the KB before acting. Over many episodes, models that consistently retrieve KB context will accumulate a scoring advantage.</w:t>
+      </w:r>
+    </w:p>
+    <w:p>
+      <w:pPr>
+        <w:pStyle w:val="ListParagraph"/>
+        <w:numPr>
+          <w:ilvl w:val="0"/>
+          <w:numId w:val="2"/>
+        </w:numPr>
+        <w:spacing w:after="40" w:before="40"/>
+      </w:pPr>
+      <w:r>
+        <w:rPr>
+          <w:rFonts w:ascii="Arial" w:cs="Arial" w:eastAsia="Arial" w:hAnsi="Arial"/>
+          <w:b/>
+          <w:bCs/>
+          <w:color w:val="000000"/>
+          <w:sz w:val="22"/>
+          <w:szCs w:val="22"/>
+        </w:rPr>
+        <w:t xml:space="preserve">+1 indexing bonus:</w:t>
+      </w:r>
+      <w:r>
+        <w:rPr>
+          <w:rFonts w:ascii="Arial" w:cs="Arial" w:eastAsia="Arial" w:hAnsi="Arial"/>
+          <w:color w:val="000000"/>
+          <w:sz w:val="22"/>
+          <w:szCs w:val="22"/>
+        </w:rPr>
+        <w:t xml:space="preserve"> Rewards contributing to the shared pool. Even a losing model that provides good escalation context earns this. Prevents the tragedy of the commons: models are compensated for enriching the KB even when they lose the episode.</w:t>
+      </w:r>
+    </w:p>
+    <w:p>
+      <w:pPr>
+        <w:pStyle w:val="ListParagraph"/>
+        <w:numPr>
+          <w:ilvl w:val="0"/>
+          <w:numId w:val="2"/>
+        </w:numPr>
+        <w:spacing w:after="40" w:before="40"/>
+      </w:pPr>
+      <w:r>
+        <w:rPr>
+          <w:rFonts w:ascii="Arial" w:cs="Arial" w:eastAsia="Arial" w:hAnsi="Arial"/>
+          <w:b/>
+          <w:bCs/>
+          <w:color w:val="000000"/>
+          <w:sz w:val="22"/>
+          <w:szCs w:val="22"/>
+        </w:rPr>
+        <w:t xml:space="preserve">+2 escalation context quality bonus:</w:t>
+      </w:r>
+      <w:r>
+        <w:rPr>
+          <w:rFonts w:ascii="Arial" w:cs="Arial" w:eastAsia="Arial" w:hAnsi="Arial"/>
+          <w:color w:val="000000"/>
+          <w:sz w:val="22"/>
+          <w:szCs w:val="22"/>
+        </w:rPr>
+        <w:t xml:space="preserve"> Rewarded when the escalation context was well-framed (clear failure reasons, precise problem statement). This keeps the losing model invested in quality KB contribution rather than giving up. Poor escalation framing is the failure mode this incentive targets.</w:t>
+      </w:r>
+    </w:p>
+    <w:p>
+      <w:pPr>
+        <w:pStyle w:val="Heading2"/>
+        <w:spacing w:after="80" w:before="240"/>
+      </w:pPr>
+      <w:r>
+        <w:rPr>
+          <w:rFonts w:ascii="Arial" w:cs="Arial" w:eastAsia="Arial" w:hAnsi="Arial"/>
+          <w:b/>
+          <w:bCs/>
+          <w:color w:val="1F4E79"/>
+          <w:sz w:val="26"/>
+          <w:szCs w:val="26"/>
+        </w:rPr>
+        <w:t xml:space="preserve">7.6  KB Quality Trajectory from Arena Operations</w:t>
+      </w:r>
+    </w:p>
+    <w:p>
+      <w:pPr>
+        <w:spacing w:after="80" w:before="60"/>
+      </w:pPr>
+      <w:r>
+        <w:rPr>
+          <w:rFonts w:ascii="Arial" w:cs="Arial" w:eastAsia="Arial" w:hAnsi="Arial"/>
+          <w:color w:val="000000"/>
+          <w:sz w:val="22"/>
+          <w:szCs w:val="22"/>
+        </w:rPr>
+        <w:t xml:space="preserve">The existing KB (§3.9) has 12 documents at quality 0.3–0.6, mostly stubs. The arena is the primary mechanism by which these scores rise toward the operational ceiling of 0.8–1.0. The trajectory:</w:t>
+      </w:r>
+    </w:p>
+    <w:p>
+      <w:pPr>
+        <w:pStyle w:val="ListParagraph"/>
+        <w:numPr>
+          <w:ilvl w:val="0"/>
+          <w:numId w:val="2"/>
+        </w:numPr>
+        <w:spacing w:after="40" w:before="40"/>
+      </w:pPr>
+      <w:r>
+        <w:rPr>
+          <w:rFonts w:ascii="Arial" w:cs="Arial" w:eastAsia="Arial" w:hAnsi="Arial"/>
+          <w:color w:val="000000"/>
+          <w:sz w:val="22"/>
+          <w:szCs w:val="22"/>
+        </w:rPr>
+        <w:t xml:space="preserve">T1 arena episodes are read-only queries against live pfSense and HA. Each successful solve triggers index_to_kb() with quality_score=0.9 on a pfsense/* or home-assistant/* topic. The existing pfsense-api-automation.md stub (quality 0.5) will be refined or superseded by higher-quality competition_solve entries on the same topic.</w:t>
+      </w:r>
+    </w:p>
+    <w:p>
+      <w:pPr>
+        <w:pStyle w:val="ListParagraph"/>
+        <w:numPr>
+          <w:ilvl w:val="0"/>
+          <w:numId w:val="2"/>
+        </w:numPr>
+        <w:spacing w:after="40" w:before="40"/>
+      </w:pPr>
+      <w:r>
+        <w:rPr>
+          <w:rFonts w:ascii="Arial" w:cs="Arial" w:eastAsia="Arial" w:hAnsi="Arial"/>
+          <w:color w:val="000000"/>
+          <w:sz w:val="22"/>
+          <w:szCs w:val="22"/>
+        </w:rPr>
+        <w:t xml:space="preserve">Escalation entries (quality_score=1.0) immediately become the highest-quality documents in the index. Any future episode on the same challenge class will retrieve them via search_kb() — the model that failed on attempt 1 will have the Claude-authored solution in its observation context on the next episode.</w:t>
+      </w:r>
+    </w:p>
+    <w:p>
+      <w:pPr>
+        <w:pStyle w:val="ListParagraph"/>
+        <w:numPr>
+          <w:ilvl w:val="0"/>
+          <w:numId w:val="2"/>
+        </w:numPr>
+        <w:spacing w:after="40" w:before="40"/>
+      </w:pPr>
+      <w:r>
+        <w:rPr>
+          <w:rFonts w:ascii="Arial" w:cs="Arial" w:eastAsia="Arial" w:hAnsi="Arial"/>
+          <w:color w:val="000000"/>
+          <w:sz w:val="22"/>
+          <w:szCs w:val="22"/>
+        </w:rPr>
+        <w:t xml:space="preserve">record_outcome() accumulates empirical_runs across episodes. As the same KB entry guides multiple successful solves, its confirmation_weight rises and quality_score converges toward the empirical ceiling of 0.95. The KB becomes a live record of what actually works on this specific hardware and network, not just what official docs say should work.</w:t>
+      </w:r>
+    </w:p>
+    <w:p>
+      <w:pPr>
+        <w:spacing w:after="80" w:before="80"/>
+      </w:pPr>
+      <w:r>
+        <w:rPr>
+          <w:rFonts w:ascii="Arial" w:cs="Arial" w:eastAsia="Arial" w:hAnsi="Arial"/>
+          <w:color w:val="595959"/>
+          <w:sz w:val="20"/>
+          <w:szCs w:val="20"/>
+          <w:i/>
+          <w:iCs/>
+        </w:rPr>
+        <w:t xml:space="preserve">Cross-references: §3 (RAG Stack architecture and authority model) — §4 (Escalation protocol, step sequence) — LSE Challenge Arena design doc §1–2 (public goods game), §4 (escalation sequence), §15 (Gymnasium integration and KB connection points).</w:t>
+      </w:r>
+    </w:p>
     <w:sectPr>
       <w:headerReference w:type="default" r:id="rId7"/>
       <w:footerReference w:type="default" r:id="rId8"/>

</xml_diff>